<commit_message>
setup dashboard, history, and dummy API integration
</commit_message>
<xml_diff>
--- a/Proposal Proyek DeepFake Detector.docx
+++ b/Proposal Proyek DeepFake Detector.docx
@@ -3856,7 +3856,12 @@
     </w:p>
     <w:p>
       <w:pPr>
-        <w:ind w:left="992" w:firstLine="447"/>
+        <w:pStyle w:val="ListParagraph"/>
+        <w:numPr>
+          <w:ilvl w:val="0"/>
+          <w:numId w:val="17"/>
+        </w:numPr>
+        <w:ind w:left="1418"/>
         <w:jc w:val="both"/>
         <w:rPr>
           <w:rFonts w:ascii="Rockwell" w:eastAsia="Rockwell" w:hAnsi="Rockwell" w:cs="Rockwell"/>
@@ -3866,16 +3871,8 @@
       <w:r>
         <w:rPr>
           <w:rFonts w:ascii="Rockwell" w:hAnsi="Rockwell"/>
-          <w:color w:val="7F7F7F" w:themeColor="text1" w:themeTint="80"/>
-        </w:rPr>
-        <w:t>Silahkan isi tentang strategi dari implementasi, dapat berupa strategi marketing dan lain sebagainya</w:t>
-      </w:r>
-      <w:r>
-        <w:rPr>
-          <w:rFonts w:ascii="Rockwell" w:hAnsi="Rockwell"/>
-          <w:color w:val="7F7F7F" w:themeColor="text1" w:themeTint="80"/>
-        </w:rPr>
-        <w:t>.</w:t>
+        </w:rPr>
+        <w:t>Github:</w:t>
       </w:r>
     </w:p>
     <w:p>
@@ -4683,7 +4680,6 @@
               <w:rPr>
                 <w:rFonts w:ascii="Rockwell" w:hAnsi="Rockwell"/>
               </w:rPr>
-              <w:lastRenderedPageBreak/>
               <w:t>8</w:t>
             </w:r>
           </w:p>
@@ -4776,6 +4772,7 @@
               <w:rPr>
                 <w:rFonts w:ascii="Rockwell" w:hAnsi="Rockwell"/>
               </w:rPr>
+              <w:lastRenderedPageBreak/>
               <w:t>9</w:t>
             </w:r>
           </w:p>
@@ -6669,6 +6666,95 @@
     </w:lvl>
   </w:abstractNum>
   <w:abstractNum w:abstractNumId="14" w15:restartNumberingAfterBreak="0">
+    <w:nsid w:val="71D66755"/>
+    <w:multiLevelType w:val="hybridMultilevel"/>
+    <w:tmpl w:val="55F61158"/>
+    <w:lvl w:ilvl="0" w:tplc="A59001DA">
+      <w:start w:val="1"/>
+      <w:numFmt w:val="lowerLetter"/>
+      <w:lvlText w:val="%1."/>
+      <w:lvlJc w:val="left"/>
+      <w:pPr>
+        <w:ind w:left="2159" w:hanging="360"/>
+      </w:pPr>
+      <w:rPr>
+        <w:color w:val="auto"/>
+      </w:rPr>
+    </w:lvl>
+    <w:lvl w:ilvl="1" w:tplc="38090019" w:tentative="1">
+      <w:start w:val="1"/>
+      <w:numFmt w:val="lowerLetter"/>
+      <w:lvlText w:val="%2."/>
+      <w:lvlJc w:val="left"/>
+      <w:pPr>
+        <w:ind w:left="2879" w:hanging="360"/>
+      </w:pPr>
+    </w:lvl>
+    <w:lvl w:ilvl="2" w:tplc="3809001B" w:tentative="1">
+      <w:start w:val="1"/>
+      <w:numFmt w:val="lowerRoman"/>
+      <w:lvlText w:val="%3."/>
+      <w:lvlJc w:val="right"/>
+      <w:pPr>
+        <w:ind w:left="3599" w:hanging="180"/>
+      </w:pPr>
+    </w:lvl>
+    <w:lvl w:ilvl="3" w:tplc="3809000F" w:tentative="1">
+      <w:start w:val="1"/>
+      <w:numFmt w:val="decimal"/>
+      <w:lvlText w:val="%4."/>
+      <w:lvlJc w:val="left"/>
+      <w:pPr>
+        <w:ind w:left="4319" w:hanging="360"/>
+      </w:pPr>
+    </w:lvl>
+    <w:lvl w:ilvl="4" w:tplc="38090019" w:tentative="1">
+      <w:start w:val="1"/>
+      <w:numFmt w:val="lowerLetter"/>
+      <w:lvlText w:val="%5."/>
+      <w:lvlJc w:val="left"/>
+      <w:pPr>
+        <w:ind w:left="5039" w:hanging="360"/>
+      </w:pPr>
+    </w:lvl>
+    <w:lvl w:ilvl="5" w:tplc="3809001B" w:tentative="1">
+      <w:start w:val="1"/>
+      <w:numFmt w:val="lowerRoman"/>
+      <w:lvlText w:val="%6."/>
+      <w:lvlJc w:val="right"/>
+      <w:pPr>
+        <w:ind w:left="5759" w:hanging="180"/>
+      </w:pPr>
+    </w:lvl>
+    <w:lvl w:ilvl="6" w:tplc="3809000F" w:tentative="1">
+      <w:start w:val="1"/>
+      <w:numFmt w:val="decimal"/>
+      <w:lvlText w:val="%7."/>
+      <w:lvlJc w:val="left"/>
+      <w:pPr>
+        <w:ind w:left="6479" w:hanging="360"/>
+      </w:pPr>
+    </w:lvl>
+    <w:lvl w:ilvl="7" w:tplc="38090019" w:tentative="1">
+      <w:start w:val="1"/>
+      <w:numFmt w:val="lowerLetter"/>
+      <w:lvlText w:val="%8."/>
+      <w:lvlJc w:val="left"/>
+      <w:pPr>
+        <w:ind w:left="7199" w:hanging="360"/>
+      </w:pPr>
+    </w:lvl>
+    <w:lvl w:ilvl="8" w:tplc="3809001B" w:tentative="1">
+      <w:start w:val="1"/>
+      <w:numFmt w:val="lowerRoman"/>
+      <w:lvlText w:val="%9."/>
+      <w:lvlJc w:val="right"/>
+      <w:pPr>
+        <w:ind w:left="7919" w:hanging="180"/>
+      </w:pPr>
+    </w:lvl>
+  </w:abstractNum>
+  <w:abstractNum w:abstractNumId="15" w15:restartNumberingAfterBreak="0">
     <w:nsid w:val="771A771F"/>
     <w:multiLevelType w:val="multilevel"/>
     <w:tmpl w:val="6218C70C"/>
@@ -6817,7 +6903,7 @@
       </w:rPr>
     </w:lvl>
   </w:abstractNum>
-  <w:abstractNum w:abstractNumId="15" w15:restartNumberingAfterBreak="0">
+  <w:abstractNum w:abstractNumId="16" w15:restartNumberingAfterBreak="0">
     <w:nsid w:val="797B3AD7"/>
     <w:multiLevelType w:val="multilevel"/>
     <w:tmpl w:val="0C5C6DBC"/>
@@ -6943,7 +7029,7 @@
     <w:abstractNumId w:val="8"/>
   </w:num>
   <w:num w:numId="5" w16cid:durableId="869149524">
-    <w:abstractNumId w:val="15"/>
+    <w:abstractNumId w:val="16"/>
   </w:num>
   <w:num w:numId="6" w16cid:durableId="1976447342">
     <w:abstractNumId w:val="1"/>
@@ -6955,7 +7041,7 @@
     <w:abstractNumId w:val="2"/>
   </w:num>
   <w:num w:numId="9" w16cid:durableId="1423185482">
-    <w:abstractNumId w:val="14"/>
+    <w:abstractNumId w:val="15"/>
   </w:num>
   <w:num w:numId="10" w16cid:durableId="1979338504">
     <w:abstractNumId w:val="9"/>
@@ -6977,6 +7063,9 @@
   </w:num>
   <w:num w:numId="16" w16cid:durableId="1975408230">
     <w:abstractNumId w:val="10"/>
+  </w:num>
+  <w:num w:numId="17" w16cid:durableId="215432425">
+    <w:abstractNumId w:val="14"/>
   </w:num>
 </w:numbering>
 </file>

</xml_diff>